<commit_message>
Remove fork name from AppSec contributions
</commit_message>
<xml_diff>
--- a/docs/resume.docx
+++ b/docs/resume.docx
@@ -474,13 +474,13 @@
           <w:b/>
           <w:bCs/>
         </w:rPr>
-        <w:t xml:space="preserve">DefectDojo contributions (dojo-n-speed).</w:t>
+        <w:t xml:space="preserve">AppSec platform contributions.</w:t>
       </w:r>
       <w:r>
         <w:t xml:space="preserve"> </w:t>
       </w:r>
       <w:r>
-        <w:t xml:space="preserve">LLM-augmented features in production AppSec tooling. Multi-SCM abstraction across GitHub, Gitea, Bitbucket, Azure DevOps. VS Code integration via URL handlers. Governance-aware infrastructure including commit-history anonymization for compliance.</w:t>
+        <w:t xml:space="preserve">Shipped LLM-augmented features in production security-findings management tooling. Multi-SCM abstraction across GitHub, Gitea, Bitbucket, Azure DevOps. VS Code integration via URL handlers. Governance-aware infrastructure including commit-history anonymization for compliance.</w:t>
       </w:r>
     </w:p>
     <w:p>

</xml_diff>

<commit_message>
Drop 'aviation and missile' specifics; keep DEVCOM AvMC reference
</commit_message>
<xml_diff>
--- a/docs/resume.docx
+++ b/docs/resume.docx
@@ -52,7 +52,7 @@
         <w:pStyle w:val="BodyText"/>
       </w:pPr>
       <w:r>
-        <w:t xml:space="preserve">I’m currently the AI SME for the DEVCOM AvMC Software Assurance team. Day to day, I design and build AI-augmented tooling for Army aviation and missile software assurance. That means LLM and RAG pipelines over CWE and CVE corpora, Code Property Graph (CPG) and AST-based static analysis, knowledge graphs, assurance dashboards, federated artifact-management research, and the papers and briefs that come out of all that.</w:t>
+        <w:t xml:space="preserve">I’m currently the AI SME for the DEVCOM AvMC Software Assurance team. Day to day, I design and build AI-augmented tooling for Army software assurance. That means LLM and RAG pipelines over CWE and CVE corpora, Code Property Graph (CPG) and AST-based static analysis, knowledge graphs, assurance dashboards, federated artifact-management research, and the papers and briefs that come out of all that.</w:t>
       </w:r>
     </w:p>
     <w:p>
@@ -120,7 +120,7 @@
         <w:t xml:space="preserve"> </w:t>
       </w:r>
       <w:r>
-        <w:t xml:space="preserve">AI Subject Matter Expert for the DEVCOM AvMC Software Assurance team. I design and build AI-augmented tooling for U.S. Army aviation and missile software-assurance programs. The active build surface looks like:</w:t>
+        <w:t xml:space="preserve">AI Subject Matter Expert for the DEVCOM AvMC Software Assurance team. I design and build AI-augmented tooling for U.S. Army software-assurance programs. The active build surface looks like:</w:t>
       </w:r>
     </w:p>
     <w:p>

</xml_diff>

<commit_message>
D.Tech not PhD; note interdisciplinary coursework spans
</commit_message>
<xml_diff>
--- a/docs/resume.docx
+++ b/docs/resume.docx
@@ -60,7 +60,7 @@
         <w:pStyle w:val="BodyText"/>
       </w:pPr>
       <w:r>
-        <w:t xml:space="preserve">I prototype fast. Working systems first, polish later. PhD work at Purdue digs into what happens to frontier LLMs once you take them offline.</w:t>
+        <w:t xml:space="preserve">I prototype fast. Working systems first, polish later. Doctoral work at Purdue digs into what happens to frontier LLMs once you take them offline.</w:t>
       </w:r>
     </w:p>
     <w:p>
@@ -541,7 +541,7 @@
         <w:t xml:space="preserve"> </w:t>
       </w:r>
       <w:r>
-        <w:t xml:space="preserve">Purdue University. Target completion around May 2027. Dissertation:</w:t>
+        <w:t xml:space="preserve">Purdue University. Coursework spans supply chain, adversarial AI, and more. Target completion around May 2027. Dissertation:</w:t>
       </w:r>
       <w:r>
         <w:t xml:space="preserve"> </w:t>

</xml_diff>

<commit_message>
Broaden denied-environments work: TARDEC ground systems + sensors/control/swarms
</commit_message>
<xml_diff>
--- a/docs/resume.docx
+++ b/docs/resume.docx
@@ -346,7 +346,7 @@
         </w:numPr>
       </w:pPr>
       <w:r>
-        <w:t xml:space="preserve">Real-time control software and sensor integration for autonomous ground systems.</w:t>
+        <w:t xml:space="preserve">Real-time control software and sensor integration for autonomous ground systems operating in denied environments.</w:t>
       </w:r>
     </w:p>
     <w:p>
@@ -751,7 +751,7 @@
         <w:t xml:space="preserve"> </w:t>
       </w:r>
       <w:r>
-        <w:t xml:space="preserve">Multi-agent coordination, autonomous control, real-time sensor integration, embedded systems, hardware-in-the-loop, swarming.</w:t>
+        <w:t xml:space="preserve">Multi-agent coordination, autonomous control, real-time sensor integration, embedded systems, hardware-in-the-loop, swarming. Software for sensors, control, and resource management of swarms in denied environments.</w:t>
       </w:r>
     </w:p>
     <w:p>

</xml_diff>

<commit_message>
Update doctoral research framing: scalable model interchange for AI/LLM in denied environments
</commit_message>
<xml_diff>
--- a/docs/resume.docx
+++ b/docs/resume.docx
@@ -60,7 +60,7 @@
         <w:pStyle w:val="BodyText"/>
       </w:pPr>
       <w:r>
-        <w:t xml:space="preserve">I prototype fast. Working systems first, polish later. Doctoral work at Purdue digs into what happens to frontier LLMs once you take them offline.</w:t>
+        <w:t xml:space="preserve">I prototype fast. Working systems first, polish later. Doctoral work at Purdue is on scalable model interchange for AI and LLMs in denied environments.</w:t>
       </w:r>
     </w:p>
     <w:p>
@@ -541,20 +541,7 @@
         <w:t xml:space="preserve"> </w:t>
       </w:r>
       <w:r>
-        <w:t xml:space="preserve">Purdue University. Coursework spans supply chain, adversarial AI, and more. Target completion around May 2027. Dissertation:</w:t>
-      </w:r>
-      <w:r>
-        <w:t xml:space="preserve"> </w:t>
-      </w:r>
-      <w:r>
-        <w:rPr>
-          <w:i/>
-          <w:iCs/>
-        </w:rPr>
-        <w:t xml:space="preserve">Operational Divergence in Air-Gapped LLMs</w:t>
-      </w:r>
-      <w:r>
-        <w:t xml:space="preserve">. Prelim Spring 2027.</w:t>
+        <w:t xml:space="preserve">Purdue University. Coursework spans supply chain, adversarial AI, and more. Research on scalable model interchange for AI and LLMs in denied environments. Target completion around May 2027. Prelim Spring 2027.</w:t>
       </w:r>
     </w:p>
     <w:p>

</xml_diff>

<commit_message>
Restore dissertation title; model interchange is adjacent research
</commit_message>
<xml_diff>
--- a/docs/resume.docx
+++ b/docs/resume.docx
@@ -60,7 +60,7 @@
         <w:pStyle w:val="BodyText"/>
       </w:pPr>
       <w:r>
-        <w:t xml:space="preserve">I prototype fast. Working systems first, polish later. Doctoral work at Purdue is on scalable model interchange for AI and LLMs in denied environments.</w:t>
+        <w:t xml:space="preserve">I prototype fast. Working systems first, polish later. Doctoral work at Purdue is on detection of operational divergence in LLMs and AI deployed in denied environments.</w:t>
       </w:r>
     </w:p>
     <w:p>
@@ -541,7 +541,20 @@
         <w:t xml:space="preserve"> </w:t>
       </w:r>
       <w:r>
-        <w:t xml:space="preserve">Purdue University. Coursework spans supply chain, adversarial AI, and more. Research on scalable model interchange for AI and LLMs in denied environments: assessing hardware, evaluating GPU presence, deploying models that fit whatever’s available. Target completion around May 2027. Prelim Spring 2027.</w:t>
+        <w:t xml:space="preserve">Purdue University. Target completion around May 2027. Prelim Spring 2027. Coursework spans supply chain, adversarial AI, and more. Dissertation:</w:t>
+      </w:r>
+      <w:r>
+        <w:t xml:space="preserve"> </w:t>
+      </w:r>
+      <w:r>
+        <w:rPr>
+          <w:i/>
+          <w:iCs/>
+        </w:rPr>
+        <w:t xml:space="preserve">Detection of Operational Divergence in LLMs and AI Deployed in Denied Environments</w:t>
+      </w:r>
+      <w:r>
+        <w:t xml:space="preserve">. Adjacent research covers scalable model interchange: assessing available hardware, evaluating GPU presence, deploying models that fit whatever’s on hand.</w:t>
       </w:r>
     </w:p>
     <w:p>

</xml_diff>

<commit_message>
Expand Core Competencies with specific tools, methods, frameworks (PyTorch, VMware, Termius, Tailscale, Obsidian, NIST/RMF, etc.)
</commit_message>
<xml_diff>
--- a/docs/resume.docx
+++ b/docs/resume.docx
@@ -733,7 +733,7 @@
         <w:t xml:space="preserve"> </w:t>
       </w:r>
       <w:r>
-        <w:t xml:space="preserve">Neural networks, deep learning, computer vision, digital signal processing. Supervised and unsupervised learning. Transfer learning. LLM deployment, retrieval-augmented generation, evaluation pipelines.</w:t>
+        <w:t xml:space="preserve">Neural networks, deep learning, computer vision, digital signal processing. Supervised, unsupervised, and transfer learning. LLM deployment across local, hybrid, and air-gapped inference. Retrieval-augmented generation over domain corpora (CWE, CVE, software-assurance reference data). Evaluation pipelines including red-team probes and divergence detection. Fine-tuning, embeddings, vector similarity. Hardware assessment for model fit and inference budgeting.</w:t>
       </w:r>
     </w:p>
     <w:p>
@@ -769,7 +769,7 @@
         <w:t xml:space="preserve"> </w:t>
       </w:r>
       <w:r>
-        <w:t xml:space="preserve">CISSP. STIGs, software assurance, compliance-bounded deployment, air-gapped and offline-inference environments, hardened production systems.</w:t>
+        <w:t xml:space="preserve">CISSP-credentialed. STIGs, NIST controls, Risk Management Framework. Software-assurance lifecycle. CWE and CVE taxonomies. Static and dynamic analysis. Compliance-bounded deployment. Air-gapped and offline-inference environments. Hardened production systems. Governance-aware infrastructure including commit-history anonymization for multi-tenant artifact handling.</w:t>
       </w:r>
     </w:p>
     <w:p>
@@ -787,7 +787,7 @@
         <w:t xml:space="preserve"> </w:t>
       </w:r>
       <w:r>
-        <w:t xml:space="preserve">MLOps, DevSecOps, containerized microservices (Docker), hybrid cloud, CI/CD, distributed computing, petabyte-scale data pipelines, Hadoop.</w:t>
+        <w:t xml:space="preserve">MLOps and DevSecOps pipelines. Containerized microservices via Docker and docker-compose. VMware for virtualization and lab work. Hybrid cloud across on-prem and AWS (EC2, t4g.nano, S3). CI/CD with GitLab CI and GitHub Actions. Distributed computing, petabyte-scale data pipelines, Hadoop. SSH-based remote workflows via Termius and Tailscale.</w:t>
       </w:r>
     </w:p>
     <w:p>
@@ -805,7 +805,7 @@
         <w:t xml:space="preserve"> </w:t>
       </w:r>
       <w:r>
-        <w:t xml:space="preserve">Python is my primary. Bash and PowerShell on the systems side. TensorFlow plus the Anthropic, OpenAI, and Ollama SDKs for LLM and AI work; Claude Vision API where vision is in scope. RAG pipelines and vector stores over CWE / CVE / software-assurance corpora. Code Property Graphs (CPG) and AST-based static analysis. Knowledge-graph and graph-database tooling for cross-artifact relationships. SQLite, SQL, pandas. Hadoop for distributed and petabyte-scale data. Docker, docker-compose, hybrid cloud on AWS (EC2, t4g.nano), GPU bursts via RunPod. Git, GitLab, GitHub, Gitea. CI/CD, MLOps, and DevSecOps pipelines. Playwright for browser automation, Typer for CLIs, Bitwarden CLI for secrets. Linux, Windows, and WSL2 development environments.</w:t>
+        <w:t xml:space="preserve">Python (primary). Bash and PowerShell on the systems side. SQL. TensorFlow, PyTorch, and Hugging Face Transformers. Anthropic, OpenAI, and Ollama SDKs for LLM and AI work. Claude Vision API where vision is in scope. RAG pipelines and vector stores over CWE / CVE / software-assurance corpora. Code Property Graphs (CPG) and AST-based static analysis. Knowledge-graph and graph-database tooling for cross-artifact relationships. SQLite, pandas, Hadoop. Docker, docker-compose, VMware. AWS (EC2, t4g.nano, S3), GPU bursts via RunPod. Git, GitLab, GitHub, Gitea. Playwright for browser automation. Typer for CLIs. Bitwarden CLI for secrets. Termius and Tailscale for SSH-based remote work. Obsidian for knowledge management, synced cross-machine via Syncthing. Linux, Windows, and WSL2 development environments.</w:t>
       </w:r>
     </w:p>
     <w:p>

</xml_diff>